<commit_message>
Quita 'operativo' del informe + anexos: módulo/componente/detalle/Monitor pierden el adjetivo. Mantiene 'alertas tempranas' como descriptor del módulo Nivel 2 Digital Twin
</commit_message>
<xml_diff>
--- a/docs/informe_final.docx
+++ b/docs/informe_final.docx
@@ -326,7 +326,7 @@
           <w:sz w:val="20"/>
           <w:szCs w:val="20"/>
         </w:rPr>
-        <w:t>La Ciénaga Grande de Santa Marta (CGSM), sitio Ramsar y Reserva de Biosfera UNESCO, constituye el complejo lagunar costero más extenso de Colombia y ha experimentado ciclos recurrentes de degradación y recuperación del manglar asociados con la hipersalinización crónica y la variabilidad climática del ciclo El Niño-Oscilación del Sur (ENSO). Este estudio caracterizó la dinámica espaciotemporal del manglar entre 2013 y 2025 sobre los 835,3 km² del área protegida oficial, conformada por el Santuario de Fauna y Flora CGSM y el Vía Parque Isla de Salamanca, mediante un pipeline multilenguaje desarrollado en Python, R y Julia. El flujo integró una serie mensual de 929 observaciones de NDVI derivadas de Landsat 8 y Sentinel-2, segmentación guiada por prompts con SamGeo, métricas de fragmentación del paisaje, detección de inundación con Sentinel-1 SAR y análisis de cuatro forzamientos climático-hidrológicos: ERA5-Land, índices ENSO de NOAA, caudal IDEAM y precipitación CHIRPS. Los resultados identificaron quiebres estructurales mediante BFAST en 2016 y un evento puntual de mortandad del manglar en septiembre de 2020, asociado con 43,08 km² de inundación bajo dosel. Entre el periodo de degradación y el estado actual, la cobertura clasificada como manglar se redujo de 12.426 ha a 4.037 ha, mientras que la estructura del paisaje mostró consolidación, con aumento del área media de parche de 157 ha a 269 ha y recuperación del NDVI mediano del dosel de 0,60 a 0,80 desde 2022. La validación doble del clasificador por umbrales obtuvo F1-scores de 0,583 frente a la cartografía oficial INVEMAR 1:25.000 y de 0,548 frente a ESA WorldCover v200, mientras que el clasificador Random Forest elevó estos valores a 0,826 y 0,889, respectivamente. Finalmente, el pipeline incorporó un módulo operativo de alertas tempranas como base para un futuro Gemelo Digital de la CGSM, clasificando las ocho estaciones de monitoreo en cinco estables, tres en alerta y ninguna en estado crítico al cierre del periodo evaluado.</w:t>
+        <w:t>La Ciénaga Grande de Santa Marta (CGSM), sitio Ramsar y Reserva de Biosfera UNESCO, constituye el complejo lagunar costero más extenso de Colombia y ha experimentado ciclos recurrentes de degradación y recuperación del manglar asociados con la hipersalinización crónica y la variabilidad climática del ciclo El Niño-Oscilación del Sur (ENSO). Este estudio caracterizó la dinámica espaciotemporal del manglar entre 2013 y 2025 sobre los 835,3 km² del área protegida oficial, conformada por el Santuario de Fauna y Flora CGSM y el Vía Parque Isla de Salamanca, mediante un pipeline multilenguaje desarrollado en Python, R y Julia. El flujo integró una serie mensual de 929 observaciones de NDVI derivadas de Landsat 8 y Sentinel-2, segmentación guiada por prompts con SamGeo, métricas de fragmentación del paisaje, detección de inundación con Sentinel-1 SAR y análisis de cuatro forzamientos climático-hidrológicos: ERA5-Land, índices ENSO de NOAA, caudal IDEAM y precipitación CHIRPS. Los resultados identificaron quiebres estructurales mediante BFAST en 2016 y un evento puntual de mortandad del manglar en septiembre de 2020, asociado con 43,08 km² de inundación bajo dosel. Entre el periodo de degradación y el estado actual, la cobertura clasificada como manglar se redujo de 12.426 ha a 4.037 ha, mientras que la estructura del paisaje mostró consolidación, con aumento del área media de parche de 157 ha a 269 ha y recuperación del NDVI mediano del dosel de 0,60 a 0,80 desde 2022. La validación doble del clasificador por umbrales obtuvo F1-scores de 0,583 frente a la cartografía oficial INVEMAR 1:25.000 y de 0,548 frente a ESA WorldCover v200, mientras que el clasificador Random Forest elevó estos valores a 0,826 y 0,889, respectivamente. Finalmente, el pipeline incorporó un módulo de alertas tempranas como base para un futuro Gemelo Digital de la CGSM, clasificando las ocho estaciones de monitoreo en cinco estables, tres en alerta y ninguna en estado crítico al cierre del periodo evaluado.</w:t>
       </w:r>
     </w:p>
     <w:p>
@@ -675,7 +675,7 @@
           <w:sz w:val="20"/>
           <w:szCs w:val="20"/>
         </w:rPr>
-        <w:t>En consecuencia, el vacío metodológico que aborda este trabajo no radica en la ausencia de información sobre manglares en la CGSM, sino en la falta de un flujo reproducible que articule, en una misma arquitectura, observación óptica, radar, segmentación automática, métricas de fragmentación, análisis de quiebres temporales y forzamientos climático-hidrológicos. La aparición de modelos fundacionales como Segment Anything Model, SAM, y su adaptación geoespacial mediante SamGeo, abre una oportunidad para complementar las clasificaciones convencionales con segmentación guiada por prompts. En paralelo, el concepto de Gemelo Digital aplicado a humedales ofrece un marco para integrar observación de la Tierra, modelos físicos, aprendizaje automático y alertas tempranas en la gestión adaptativa de ecosistemas. Bajo este enfoque, el presente proyecto se plantea como un componente operativo inicial para el seguimiento reproducible del manglar de la CGSM, conectando series satelitales, segmentación espacial, fragmentación del paisaje y forzamientos hidroclimáticos.</w:t>
+        <w:t>En consecuencia, el vacío metodológico que aborda este trabajo no radica en la ausencia de información sobre manglares en la CGSM, sino en la falta de un flujo reproducible que articule, en una misma arquitectura, observación óptica, radar, segmentación automática, métricas de fragmentación, análisis de quiebres temporales y forzamientos climático-hidrológicos. La aparición de modelos fundacionales como Segment Anything Model, SAM, y su adaptación geoespacial mediante SamGeo, abre una oportunidad para complementar las clasificaciones convencionales con segmentación guiada por prompts. En paralelo, el concepto de Gemelo Digital aplicado a humedales ofrece un marco para integrar observación de la Tierra, modelos físicos, aprendizaje automático y alertas tempranas en la gestión adaptativa de ecosistemas. Bajo este enfoque, el presente proyecto se plantea como un componente inicial para el seguimiento reproducible del manglar de la CGSM, conectando series satelitales, segmentación espacial, fragmentación del paisaje y forzamientos hidroclimáticos.</w:t>
       </w:r>
     </w:p>
     <w:bookmarkEnd w:id="2"/>
@@ -5671,7 +5671,7 @@
           <w:sz w:val="20"/>
           <w:szCs w:val="20"/>
         </w:rPr>
-        <w:t>El flujo metodológico completo se resume en la Figura 3, que integra las cinco fases técnicas y el módulo transversal de forzamiento climático. El detalle operativo de entradas, herramientas, lenguajes y salidas se presenta en el Anexo F.7.</w:t>
+        <w:t>El flujo metodológico completo se resume en la Figura 3, que integra las cinco fases técnicas y el módulo transversal de forzamiento climático. El detalle de implementación de entradas, herramientas, lenguajes y salidas se presenta en el Anexo F.7.</w:t>
       </w:r>
     </w:p>
     <w:p>
@@ -14604,7 +14604,7 @@
           <w:sz w:val="20"/>
           <w:szCs w:val="20"/>
         </w:rPr>
-        <w:t>8.8 Módulo operativo de alertas tempranas</w:t>
+        <w:t>8.8 Módulo de alertas tempranas</w:t>
       </w:r>
     </w:p>
     <w:p>
@@ -17063,7 +17063,7 @@
           <w:sz w:val="20"/>
           <w:szCs w:val="20"/>
         </w:rPr>
-        <w:t>En este contexto, el módulo de alertas tempranas desarrollado en este trabajo se plantea como un componente operativo inicial para apoyar la vigilancia de perturbaciones hidroclimáticas en humedales costeros tropicales. La articulación entre BFAST, la Global Flood Database, los forzamientos asociados a ENSO y la vigilancia mensual de NDVI y SAR-VH permite transformar datos satelitales en indicadores útiles para la gestión adaptativa, la priorización de zonas de monitoreo y la respuesta ante crisis ambientales.</w:t>
+        <w:t>En este contexto, el módulo de alertas tempranas desarrollado en este trabajo se plantea como un componente inicial para apoyar la vigilancia de perturbaciones hidroclimáticas en humedales costeros tropicales. La articulación entre BFAST, la Global Flood Database, los forzamientos asociados a ENSO y la vigilancia mensual de NDVI y SAR-VH permite transformar datos satelitales en indicadores útiles para la gestión adaptativa, la priorización de zonas de monitoreo y la respuesta ante crisis ambientales.</w:t>
       </w:r>
     </w:p>
     <w:bookmarkEnd w:id="27"/>

</xml_diff>